<commit_message>
v0.12.0: tabla de capacidad de trims con datos de fabricantes
- Cv, puerto y carrera típicos de globo y ángulo por familia de trim (mediana
  de datos publicados), trim reducido por restricciones en serie y alerta de
  coherencia ±10 %.
- Solapa 2: estilo de trim, sentido de flujo y característica independientes;
  Flow del actuador tomado del sentido; conversión de proyectos anteriores.
- Selección de trims especiales: verificación de capacidad y rangeabilidad.
- Materiales: «sin cavitación», temperatura de operación para corrosión y
  cloruros por encima de 100 °C en austeníticos.
- Ayuda ampliada (sentido de flujo, tabla de capacidad, Fγ), sentido de flujo
  en entregables, kit del workshop regenerado y pruebas de v0.12.0.

Co-Authored-By: Claude Opus 5.5 (1M context) <noreply@anthropic.com>
Claude-Session: https://claude.ai/code/session_01U4yJ7uLSXttFganqs6AWmH
</commit_message>
<xml_diff>
--- a/kit_workshop/Casos_del_workshop_N25-Valves-Sizing.docx
+++ b/kit_workshop/Casos_del_workshop_N25-Valves-Sizing.docx
@@ -18,7 +18,7 @@
           <w:color w:val="55606D"/>
           <w:sz w:val="22"/>
         </w:rPr>
-        <w:t>N25 Valves Sizing 0.8.1 · Workshop del sábado 24 de octubre de 2026</w:t>
+        <w:t>N25 Valves Sizing 0.12.0 · Workshop del 24 de octubre de 2026 (resultados actualizados)</w:t>
       </w:r>
     </w:p>
     <w:p>
@@ -696,7 +696,7 @@
               <w:rPr>
                 <w:sz w:val="19"/>
               </w:rPr>
-              <w:t>Mariposa triple excéntrica, 90°</w:t>
+              <w:t>Triple excéntrica · 90°</w:t>
             </w:r>
           </w:p>
         </w:tc>
@@ -752,7 +752,7 @@
               <w:rPr>
                 <w:sz w:val="19"/>
               </w:rPr>
-              <w:t>Lineal</w:t>
+              <w:t>Isoporcentual</w:t>
             </w:r>
           </w:p>
         </w:tc>
@@ -2063,7 +2063,7 @@
     </w:p>
     <w:p>
       <w:r>
-        <w:t>Válvula: Mariposa triple excentricidad, 8" (DN 200), CL150, Wafer; internos: mariposa triple excéntrica, 90°; Cv nominal típico 1.920. Cv máximo requerido: 1.046 · Sin fenómenos que requieran acción.</w:t>
+        <w:t>Válvula: Mariposa triple excentricidad, 8" (DN 200), CL150, Wafer; internos: mariposa triple excéntrica, 90°; Cv nominal típico 1.920. Diámetro del orificio / disco: 8 in (202,7 mm) estimado · Rotación: Rotación nominal 90° Cv máximo requerido: 1.046 · Hay advertencias para revisar.</w:t>
       </w:r>
     </w:p>
     <w:tbl>
@@ -2265,7 +2265,7 @@
               <w:rPr>
                 <w:sz w:val="19"/>
               </w:rPr>
-              <w:t>20,6</w:t>
+              <w:t>57,1</w:t>
             </w:r>
           </w:p>
         </w:tc>
@@ -2278,7 +2278,7 @@
               <w:rPr>
                 <w:sz w:val="19"/>
               </w:rPr>
-              <w:t>33,1</w:t>
+              <w:t>69,4</w:t>
             </w:r>
           </w:p>
         </w:tc>
@@ -2291,7 +2291,7 @@
               <w:rPr>
                 <w:sz w:val="19"/>
               </w:rPr>
-              <w:t>52,9</w:t>
+              <w:t>82,1</w:t>
             </w:r>
           </w:p>
         </w:tc>
@@ -2574,7 +2574,7 @@
               <w:rPr>
                 <w:sz w:val="19"/>
               </w:rPr>
-              <w:t>ΔP para flujo estrangulado (ΔP choked)</w:t>
+              <w:t>ΔP crítica de flujo estrangulado (ΔP choked)</w:t>
             </w:r>
           </w:p>
         </w:tc>
@@ -3277,7 +3277,7 @@
               <w:rPr>
                 <w:sz w:val="19"/>
               </w:rPr>
-              <w:t>Stellite 6 macizo (Co-Cr-W, fundido o forjado 6B)</w:t>
+              <w:t>17-4PH H900 (40–47 HRC)</w:t>
             </w:r>
           </w:p>
         </w:tc>
@@ -3290,7 +3290,7 @@
               <w:rPr>
                 <w:sz w:val="19"/>
               </w:rPr>
-              <w:t>40 HRC (≈ 371 HB)</w:t>
+              <w:t>44 HRC (≈ 411 HB)</w:t>
             </w:r>
           </w:p>
         </w:tc>
@@ -3318,7 +3318,7 @@
               <w:rPr>
                 <w:sz w:val="19"/>
               </w:rPr>
-              <w:t>Inconel 718 (N07718) envejecido</w:t>
+              <w:t>17-4PH H1150D (≤ 33 HRC, NACE)</w:t>
             </w:r>
           </w:p>
         </w:tc>
@@ -3331,7 +3331,7 @@
               <w:rPr>
                 <w:sz w:val="19"/>
               </w:rPr>
-              <w:t>38 HRC (≈ 353 HB)</w:t>
+              <w:t>30 HRC (≈ 286 HB)</w:t>
             </w:r>
           </w:p>
         </w:tc>
@@ -3359,7 +3359,7 @@
               <w:rPr>
                 <w:sz w:val="19"/>
               </w:rPr>
-              <w:t>Inconel 718 (N07718) envejecido</w:t>
+              <w:t>17-4PH H1075 (≈ 33–38 HRC)</w:t>
             </w:r>
           </w:p>
         </w:tc>
@@ -3372,7 +3372,7 @@
               <w:rPr>
                 <w:sz w:val="19"/>
               </w:rPr>
-              <w:t>38 HRC (≈ 353 HB)</w:t>
+              <w:t>35 HRC (≈ 327 HB)</w:t>
             </w:r>
           </w:p>
         </w:tc>
@@ -3400,7 +3400,7 @@
               <w:rPr>
                 <w:sz w:val="19"/>
               </w:rPr>
-              <w:t>Dúplex 2205 (S31803 / S32205) barra</w:t>
+              <w:t>Inoxidable 316 / 316L (A479, A276)</w:t>
             </w:r>
           </w:p>
         </w:tc>
@@ -3413,7 +3413,7 @@
               <w:rPr>
                 <w:sz w:val="19"/>
               </w:rPr>
-              <w:t>250 HB</w:t>
+              <w:t>150 HB</w:t>
             </w:r>
           </w:p>
         </w:tc>
@@ -3586,7 +3586,7 @@
     <w:p/>
     <w:p>
       <w:r>
-        <w:t>Mecanismos de deterioro detectados: M02 Corrosión localizada por cloruros (picaduras / rendijas); M03 Corrosión bajo tensión por cloruros (Cl-SCC); M16 Cavitación.</w:t>
+        <w:t>Mecanismos de deterioro detectados: M02 Corrosión localizada por cloruros (picaduras / rendijas); M16 Cavitación.</w:t>
       </w:r>
     </w:p>
     <w:p>
@@ -3595,6 +3595,22 @@
       </w:pPr>
       <w:r>
         <w:t>Alertas que muestra el programa</w:t>
+      </w:r>
+    </w:p>
+    <w:p>
+      <w:pPr>
+        <w:pStyle w:val="ListBullet"/>
+      </w:pPr>
+      <w:r>
+        <w:t>Advertencia: Riesgo medio de galling: bola / disco / obturador – anillo de asiento</w:t>
+      </w:r>
+    </w:p>
+    <w:p>
+      <w:pPr>
+        <w:pStyle w:val="ListBullet"/>
+      </w:pPr>
+      <w:r>
+        <w:t>Advertencia: Riesgo medio de galling: bola / disco / obturador – cojinetes del eje</w:t>
       </w:r>
     </w:p>
     <w:p>
@@ -3627,6 +3643,14 @@
       </w:pPr>
       <w:r>
         <w:t>Información: Dureza mínima de los internos</w:t>
+      </w:r>
+    </w:p>
+    <w:p>
+      <w:pPr>
+        <w:pStyle w:val="ListBullet"/>
+      </w:pPr>
+      <w:r>
+        <w:t>Información: Factores de par estimados</w:t>
       </w:r>
     </w:p>
     <w:p>
@@ -4040,7 +4064,7 @@
               <w:rPr>
                 <w:sz w:val="19"/>
               </w:rPr>
-              <w:t>Globo, jaula caracterizada 4 ventanas, flujo de adentro hacia afuera de la jaula (tiende a abrir)</w:t>
+              <w:t>Jaula caracterizada 4 ventanas</w:t>
             </w:r>
           </w:p>
         </w:tc>
@@ -5144,7 +5168,7 @@
     </w:p>
     <w:p>
       <w:r>
-        <w:t>Válvula: Globo, 3" (DN 80), CL600, RF bridada; internos: globo, jaula caracterizada 4 ventanas, flujo de adentro hacia afuera de la jaula (tiende a abrir); Cv nominal típico 126,0. Cv máximo requerido: 54,05 · Hay condiciones críticas: vea las alertas y el informe técnico.</w:t>
+        <w:t>Válvula: Globo, 3" (DN 80), CL600, RF bridada; internos: globo, jaula caracterizada 4 ventanas, flujo de adentro hacia afuera de la jaula (tiende a abrir); Cv nominal típico 142,0. Tamaño del trim (diámetro del puerto): 3 7/16 in (87,3 mm) estimado · Carrera nominal: 1 1/2 in (38,1 mm) estimada Cv máximo requerido: 54,05 · Hay condiciones críticas: vea las alertas y el informe técnico.</w:t>
       </w:r>
     </w:p>
     <w:tbl>
@@ -5346,7 +5370,7 @@
               <w:rPr>
                 <w:sz w:val="19"/>
               </w:rPr>
-              <w:t>16,0</w:t>
+              <w:t>14,0</w:t>
             </w:r>
           </w:p>
         </w:tc>
@@ -5359,7 +5383,7 @@
               <w:rPr>
                 <w:sz w:val="19"/>
               </w:rPr>
-              <w:t>26,0</w:t>
+              <w:t>22,8</w:t>
             </w:r>
           </w:p>
         </w:tc>
@@ -5372,7 +5396,7 @@
               <w:rPr>
                 <w:sz w:val="19"/>
               </w:rPr>
-              <w:t>41,7</w:t>
+              <w:t>36,8</w:t>
             </w:r>
           </w:p>
         </w:tc>
@@ -6790,7 +6814,7 @@
               <w:rPr>
                 <w:sz w:val="19"/>
               </w:rPr>
-              <w:t>Grafito flexible (anillos laminados + trenzas de carbono antiextrusión)</w:t>
+              <w:t>Grafito simple: cinta moldeada + trenzas de carbono antiextrusión</w:t>
             </w:r>
           </w:p>
         </w:tc>
@@ -7020,6 +7044,14 @@
     </w:p>
     <w:p>
       <w:pPr>
+        <w:pStyle w:val="ListBullet"/>
+      </w:pPr>
+      <w:r>
+        <w:t>Información: Aire máximo sobre el límite del actuador</w:t>
+      </w:r>
+    </w:p>
+    <w:p>
+      <w:pPr>
         <w:pStyle w:val="Heading2"/>
       </w:pPr>
       <w:r>
@@ -7437,7 +7469,7 @@
               <w:rPr>
                 <w:sz w:val="19"/>
               </w:rPr>
-              <w:t>Globo, internos multietapa (anticavitación severa)</w:t>
+              <w:t>Multietapa (anticavitación severa)</w:t>
             </w:r>
           </w:p>
         </w:tc>
@@ -8860,7 +8892,7 @@
     </w:p>
     <w:p>
       <w:r>
-        <w:t>Válvula: Globo, 3" (DN 80), CL600, RF bridada; internos: globo, internos multietapa (anticavitación severa); Cv nominal típico 31,50. Cv máximo requerido: 19,33 · Hay condiciones críticas: vea las alertas y el informe técnico.</w:t>
+        <w:t>Válvula: Globo, 2" (DN 50), CL600, RF bridada; internos: globo, internos multietapa (anticavitación severa), flujo tiende a abrir; Cv nominal típico 26,00. Tamaño del trim (diámetro del puerto): 2 1/4 in (57,1 mm) estimado · Carrera nominal: 1 1/2 in (38,1 mm) estimada Cv máximo requerido: 19,59 · Hay condiciones críticas: vea las alertas y el informe técnico.</w:t>
       </w:r>
     </w:p>
     <w:tbl>
@@ -8995,7 +9027,7 @@
               <w:rPr>
                 <w:sz w:val="19"/>
               </w:rPr>
-              <w:t>5,773</w:t>
+              <w:t>5,780</w:t>
             </w:r>
           </w:p>
         </w:tc>
@@ -9008,7 +9040,7 @@
               <w:rPr>
                 <w:sz w:val="19"/>
               </w:rPr>
-              <w:t>13,18</w:t>
+              <w:t>13,26</w:t>
             </w:r>
           </w:p>
         </w:tc>
@@ -9021,7 +9053,7 @@
               <w:rPr>
                 <w:sz w:val="19"/>
               </w:rPr>
-              <w:t>19,33</w:t>
+              <w:t>19,59</w:t>
             </w:r>
           </w:p>
         </w:tc>
@@ -9062,7 +9094,7 @@
               <w:rPr>
                 <w:sz w:val="19"/>
               </w:rPr>
-              <w:t>15,5</w:t>
+              <w:t>19,8</w:t>
             </w:r>
           </w:p>
         </w:tc>
@@ -9075,7 +9107,7 @@
               <w:rPr>
                 <w:sz w:val="19"/>
               </w:rPr>
-              <w:t>39,8</w:t>
+              <w:t>49,5</w:t>
             </w:r>
           </w:p>
         </w:tc>
@@ -9088,7 +9120,7 @@
               <w:rPr>
                 <w:sz w:val="19"/>
               </w:rPr>
-              <w:t>60,0</w:t>
+              <w:t>74,6</w:t>
             </w:r>
           </w:p>
         </w:tc>
@@ -9276,7 +9308,7 @@
               <w:rPr>
                 <w:sz w:val="19"/>
               </w:rPr>
-              <w:t>0,940</w:t>
+              <w:t>0,939</w:t>
             </w:r>
           </w:p>
         </w:tc>
@@ -9289,7 +9321,7 @@
               <w:rPr>
                 <w:sz w:val="19"/>
               </w:rPr>
-              <w:t>0,939</w:t>
+              <w:t>0,938</w:t>
             </w:r>
           </w:p>
         </w:tc>
@@ -9304,7 +9336,7 @@
               <w:rPr>
                 <w:sz w:val="19"/>
               </w:rPr>
-              <w:t>ΔP para flujo estrangulado (ΔP choked)</w:t>
+              <w:t>ΔP crítica de flujo estrangulado (ΔP choked)</w:t>
             </w:r>
           </w:p>
         </w:tc>
@@ -9330,7 +9362,7 @@
               <w:rPr>
                 <w:sz w:val="19"/>
               </w:rPr>
-              <w:t>68,22</w:t>
+              <w:t>68,21</w:t>
             </w:r>
           </w:p>
         </w:tc>
@@ -9343,7 +9375,7 @@
               <w:rPr>
                 <w:sz w:val="19"/>
               </w:rPr>
-              <w:t>66,29</w:t>
+              <w:t>66,24</w:t>
             </w:r>
           </w:p>
         </w:tc>
@@ -9356,7 +9388,7 @@
               <w:rPr>
                 <w:sz w:val="19"/>
               </w:rPr>
-              <w:t>64,35</w:t>
+              <w:t>64,25</w:t>
             </w:r>
           </w:p>
         </w:tc>
@@ -9397,7 +9429,7 @@
               <w:rPr>
                 <w:sz w:val="19"/>
               </w:rPr>
-              <w:t>1,000</w:t>
+              <w:t>0,999</w:t>
             </w:r>
           </w:p>
         </w:tc>
@@ -9410,7 +9442,7 @@
               <w:rPr>
                 <w:sz w:val="19"/>
               </w:rPr>
-              <w:t>1,000</w:t>
+              <w:t>0,994</w:t>
             </w:r>
           </w:p>
         </w:tc>
@@ -9423,7 +9455,7 @@
               <w:rPr>
                 <w:sz w:val="19"/>
               </w:rPr>
-              <w:t>0,999</w:t>
+              <w:t>0,987</w:t>
             </w:r>
           </w:p>
         </w:tc>
@@ -9464,7 +9496,7 @@
               <w:rPr>
                 <w:sz w:val="19"/>
               </w:rPr>
-              <w:t>0,970</w:t>
+              <w:t>0,969</w:t>
             </w:r>
           </w:p>
         </w:tc>
@@ -9477,7 +9509,7 @@
               <w:rPr>
                 <w:sz w:val="19"/>
               </w:rPr>
-              <w:t>0,969</w:t>
+              <w:t>0,963</w:t>
             </w:r>
           </w:p>
         </w:tc>
@@ -9490,7 +9522,7 @@
               <w:rPr>
                 <w:sz w:val="19"/>
               </w:rPr>
-              <w:t>0,968</w:t>
+              <w:t>0,956</w:t>
             </w:r>
           </w:p>
         </w:tc>
@@ -9665,7 +9697,7 @@
               <w:rPr>
                 <w:sz w:val="19"/>
               </w:rPr>
-              <w:t>214.935</w:t>
+              <w:t>214.811</w:t>
             </w:r>
           </w:p>
         </w:tc>
@@ -9678,7 +9710,7 @@
               <w:rPr>
                 <w:sz w:val="19"/>
               </w:rPr>
-              <w:t>320.139</w:t>
+              <w:t>319.169</w:t>
             </w:r>
           </w:p>
         </w:tc>
@@ -9691,7 +9723,7 @@
               <w:rPr>
                 <w:sz w:val="19"/>
               </w:rPr>
-              <w:t>381.957</w:t>
+              <w:t>379.457</w:t>
             </w:r>
           </w:p>
         </w:tc>
@@ -9732,7 +9764,7 @@
               <w:rPr>
                 <w:sz w:val="19"/>
               </w:rPr>
-              <w:t>72,1</w:t>
+              <w:t>77,8</w:t>
             </w:r>
           </w:p>
         </w:tc>
@@ -9745,7 +9777,7 @@
               <w:rPr>
                 <w:sz w:val="19"/>
               </w:rPr>
-              <w:t>77,1</w:t>
+              <w:t>83,9</w:t>
             </w:r>
           </w:p>
         </w:tc>
@@ -9758,7 +9790,7 @@
               <w:rPr>
                 <w:sz w:val="19"/>
               </w:rPr>
-              <w:t>78,9</w:t>
+              <w:t>86,8</w:t>
             </w:r>
           </w:p>
         </w:tc>
@@ -10474,7 +10506,7 @@
         <w:pStyle w:val="ListBullet"/>
       </w:pPr>
       <w:r>
-        <w:t>Advertencia: Fuerza de desbalance alta</w:t>
+        <w:t>Crítica: Carga del vástago excesiva (pandeo)</w:t>
       </w:r>
     </w:p>
     <w:p>
@@ -10483,6 +10515,30 @@
       </w:pPr>
       <w:r>
         <w:t>Advertencia: Velocidad alta en la tubería de entrada</w:t>
+      </w:r>
+    </w:p>
+    <w:p>
+      <w:pPr>
+        <w:pStyle w:val="ListBullet"/>
+      </w:pPr>
+      <w:r>
+        <w:t>Advertencia: Etapas anticavitación recomendadas</w:t>
+      </w:r>
+    </w:p>
+    <w:p>
+      <w:pPr>
+        <w:pStyle w:val="ListBullet"/>
+      </w:pPr>
+      <w:r>
+        <w:t>Advertencia: Velocidad de líquido alta en la válvula</w:t>
+      </w:r>
+    </w:p>
+    <w:p>
+      <w:pPr>
+        <w:pStyle w:val="ListBullet"/>
+      </w:pPr>
+      <w:r>
+        <w:t>Advertencia: Ruido por encima del límite</w:t>
       </w:r>
     </w:p>
     <w:p>
@@ -10514,6 +10570,14 @@
         <w:pStyle w:val="ListBullet"/>
       </w:pPr>
       <w:r>
+        <w:t>Información: Ruido cercano al límite</w:t>
+      </w:r>
+    </w:p>
+    <w:p>
+      <w:pPr>
+        <w:pStyle w:val="ListBullet"/>
+      </w:pPr>
+      <w:r>
         <w:t>Información: Dureza mínima de los internos</w:t>
       </w:r>
     </w:p>
@@ -10531,6 +10595,22 @@
       </w:pPr>
       <w:r>
         <w:t>Información: Rating por el forjado equivalente</w:t>
+      </w:r>
+    </w:p>
+    <w:p>
+      <w:pPr>
+        <w:pStyle w:val="ListBullet"/>
+      </w:pPr>
+      <w:r>
+        <w:t>Información: Vida del cierre clase V</w:t>
+      </w:r>
+    </w:p>
+    <w:p>
+      <w:pPr>
+        <w:pStyle w:val="ListBullet"/>
+      </w:pPr>
+      <w:r>
+        <w:t>Información: Aire máximo sobre el límite del actuador</w:t>
       </w:r>
     </w:p>
     <w:p>

</xml_diff>

<commit_message>
v0.13.0: trims por tipo, guía y nivel; multietapa multiorificio para gas
- Desplegables en orden: tipo de trim (obturador / jaula), guía y obturador, o jaula según fluido,
  nivel o etapas individual con su mitigación, sentido, balance y característica permitida.
- Jaula multietapa multiorificio para gas (2, 3 y 4 etapas) con ruido de la última etapa.
- Obturador en V, microcaudal (hasta 2"), disco plano, característica parabólica modificada.
- Migración de proyectos v0.11 y v0.12; kit del workshop regenerado.

Co-Authored-By: Claude Opus 5.5 <noreply@anthropic.com>
Claude-Session: https://claude.ai/code/session_01U4yJ7uLSXttFganqs6AWmH
</commit_message>
<xml_diff>
--- a/kit_workshop/Casos_del_workshop_N25-Valves-Sizing.docx
+++ b/kit_workshop/Casos_del_workshop_N25-Valves-Sizing.docx
@@ -18,7 +18,7 @@
           <w:color w:val="55606D"/>
           <w:sz w:val="22"/>
         </w:rPr>
-        <w:t>N25 Valves Sizing 0.12.0 · Workshop del 24 de octubre de 2026 (resultados actualizados)</w:t>
+        <w:t>N25 Valves Sizing 0.8.1 · Workshop del sábado 24 de octubre de 2026</w:t>
       </w:r>
     </w:p>
     <w:p>
@@ -249,7 +249,7 @@
               <w:rPr>
                 <w:sz w:val="19"/>
               </w:rPr>
-              <w:t>Agua producida agria con arena, 72 → 3,5 bar g, multietapa CL600</w:t>
+              <w:t>Agua producida agria con arena, 72 → 3,5 bar g, jaula anticavitación CL600</w:t>
             </w:r>
           </w:p>
         </w:tc>
@@ -683,7 +683,7 @@
               <w:rPr>
                 <w:sz w:val="19"/>
               </w:rPr>
-              <w:t>Trim</w:t>
+              <w:t>Tipo de trim</w:t>
             </w:r>
           </w:p>
         </w:tc>
@@ -696,7 +696,6 @@
               <w:rPr>
                 <w:sz w:val="19"/>
               </w:rPr>
-              <w:t>Triple excéntrica · 90°</w:t>
             </w:r>
           </w:p>
         </w:tc>
@@ -711,7 +710,7 @@
               <w:rPr>
                 <w:sz w:val="19"/>
               </w:rPr>
-              <w:t>Obturador</w:t>
+              <w:t>Jaula</w:t>
             </w:r>
           </w:p>
         </w:tc>
@@ -724,7 +723,7 @@
               <w:rPr>
                 <w:sz w:val="19"/>
               </w:rPr>
-              <w:t>Desbalanceado</w:t>
+              <w:t>Triple excéntrica · 90°</w:t>
             </w:r>
           </w:p>
         </w:tc>
@@ -739,7 +738,7 @@
               <w:rPr>
                 <w:sz w:val="19"/>
               </w:rPr>
-              <w:t>Característica</w:t>
+              <w:t>Balance del obturador</w:t>
             </w:r>
           </w:p>
         </w:tc>
@@ -752,7 +751,7 @@
               <w:rPr>
                 <w:sz w:val="19"/>
               </w:rPr>
-              <w:t>Isoporcentual</w:t>
+              <w:t>Desbalanceado</w:t>
             </w:r>
           </w:p>
         </w:tc>
@@ -767,7 +766,7 @@
               <w:rPr>
                 <w:sz w:val="19"/>
               </w:rPr>
-              <w:t>Trim de bajo ruido</w:t>
+              <w:t>Característica</w:t>
             </w:r>
           </w:p>
         </w:tc>
@@ -780,7 +779,7 @@
               <w:rPr>
                 <w:sz w:val="19"/>
               </w:rPr>
-              <w:t>Estándar (pasaje único)</w:t>
+              <w:t>Isoporcentual</w:t>
             </w:r>
           </w:p>
         </w:tc>
@@ -4051,7 +4050,7 @@
               <w:rPr>
                 <w:sz w:val="19"/>
               </w:rPr>
-              <w:t>Trim</w:t>
+              <w:t>Tipo de trim</w:t>
             </w:r>
           </w:p>
         </w:tc>
@@ -4064,7 +4063,7 @@
               <w:rPr>
                 <w:sz w:val="19"/>
               </w:rPr>
-              <w:t>Jaula caracterizada 4 ventanas</w:t>
+              <w:t>Guiado por jaula</w:t>
             </w:r>
           </w:p>
         </w:tc>
@@ -4079,7 +4078,7 @@
               <w:rPr>
                 <w:sz w:val="19"/>
               </w:rPr>
-              <w:t>Obturador</w:t>
+              <w:t>Jaula</w:t>
             </w:r>
           </w:p>
         </w:tc>
@@ -4092,7 +4091,7 @@
               <w:rPr>
                 <w:sz w:val="19"/>
               </w:rPr>
-              <w:t>Balanceado</w:t>
+              <w:t>Jaula caracterizada de ventanas</w:t>
             </w:r>
           </w:p>
         </w:tc>
@@ -4107,7 +4106,7 @@
               <w:rPr>
                 <w:sz w:val="19"/>
               </w:rPr>
-              <w:t>Característica</w:t>
+              <w:t>Balance del obturador</w:t>
             </w:r>
           </w:p>
         </w:tc>
@@ -4120,7 +4119,7 @@
               <w:rPr>
                 <w:sz w:val="19"/>
               </w:rPr>
-              <w:t>Lineal</w:t>
+              <w:t>Balanceado</w:t>
             </w:r>
           </w:p>
         </w:tc>
@@ -4135,7 +4134,7 @@
               <w:rPr>
                 <w:sz w:val="19"/>
               </w:rPr>
-              <w:t>Trim de bajo ruido</w:t>
+              <w:t>Característica</w:t>
             </w:r>
           </w:p>
         </w:tc>
@@ -4148,7 +4147,7 @@
               <w:rPr>
                 <w:sz w:val="19"/>
               </w:rPr>
-              <w:t>Estándar (pasaje único)</w:t>
+              <w:t>Lineal</w:t>
             </w:r>
           </w:p>
         </w:tc>
@@ -6200,7 +6199,7 @@
               <w:rPr>
                 <w:sz w:val="19"/>
               </w:rPr>
-              <w:t>Multietapa o silenciador</w:t>
+              <w:t>Multietapa, 4 etapas</w:t>
             </w:r>
           </w:p>
         </w:tc>
@@ -7063,7 +7062,7 @@
         <w:ind w:left="340" w:hanging="340"/>
       </w:pPr>
       <w:r>
-        <w:t>1. El ruido con trim estándar supera el límite de 85 dB(A). En 2-Cálculos Válvula pruebe «Jaula multiorificio, nivel 2» y luego «nivel 3»: ¿cuánto baja y alcanza?</w:t>
+        <w:t>1. El ruido con trim estándar supera el límite de 85 dB(A). En 2-Cálculos Válvula elija la jaula «Jaula multiorificio de bajo ruido» y pruebe los niveles 2 y 3; luego la «Jaula multietapa multiorificio» con 2 y 3 etapas: ¿cuánto baja cada una y cuál alcanza?</w:t>
       </w:r>
     </w:p>
     <w:p>
@@ -7105,7 +7104,7 @@
     </w:p>
     <w:p>
       <w:r>
-        <w:t>Control de nivel de agua del separador trifásico V-1201, que descarga a un tanque skimmer casi atmosférico. El agua producida tiene 85 000 mg/L de cloruros, H₂S, CO₂ y arena. La caída de presión supera el 93 % de P1: aun con internos multietapa hay cavitación con flujo bloqueado. Es el tipo de servicio donde una mala selección de materiales o de empaquetadura termina en una falla o una fuga.</w:t>
+        <w:t>Control de nivel de agua del separador trifásico V-1201, que descarga a un tanque skimmer casi atmosférico. El agua producida tiene 85 000 mg/L de cloruros, H₂S, CO₂ y arena. La caída de presión supera el 93 % de P1: con una jaula anticavitación de 1 etapa hay cavitación con flujo bloqueado. Es el tipo de servicio donde una mala selección de materiales o de empaquetadura termina en una falla o una fuga.</w:t>
       </w:r>
     </w:p>
     <w:p>
@@ -7456,7 +7455,7 @@
               <w:rPr>
                 <w:sz w:val="19"/>
               </w:rPr>
-              <w:t>Trim</w:t>
+              <w:t>Tipo de trim</w:t>
             </w:r>
           </w:p>
         </w:tc>
@@ -7469,7 +7468,7 @@
               <w:rPr>
                 <w:sz w:val="19"/>
               </w:rPr>
-              <w:t>Multietapa (anticavitación severa)</w:t>
+              <w:t>Guiado por jaula</w:t>
             </w:r>
           </w:p>
         </w:tc>
@@ -7484,7 +7483,7 @@
               <w:rPr>
                 <w:sz w:val="19"/>
               </w:rPr>
-              <w:t>Obturador</w:t>
+              <w:t>Jaula</w:t>
             </w:r>
           </w:p>
         </w:tc>
@@ -7497,7 +7496,7 @@
               <w:rPr>
                 <w:sz w:val="19"/>
               </w:rPr>
-              <w:t>Desbalanceado</w:t>
+              <w:t>Jaula anticavitación</w:t>
             </w:r>
           </w:p>
         </w:tc>
@@ -7512,7 +7511,7 @@
               <w:rPr>
                 <w:sz w:val="19"/>
               </w:rPr>
-              <w:t>Característica</w:t>
+              <w:t>Nivel o etapas</w:t>
             </w:r>
           </w:p>
         </w:tc>
@@ -7525,7 +7524,7 @@
               <w:rPr>
                 <w:sz w:val="19"/>
               </w:rPr>
-              <w:t>Lineal</w:t>
+              <w:t>1 etapa – Kc 0,85, FL 0,93</w:t>
             </w:r>
           </w:p>
         </w:tc>
@@ -7540,7 +7539,7 @@
               <w:rPr>
                 <w:sz w:val="19"/>
               </w:rPr>
-              <w:t>Trim de bajo ruido</w:t>
+              <w:t>Balance del obturador</w:t>
             </w:r>
           </w:p>
         </w:tc>
@@ -7553,7 +7552,35 @@
               <w:rPr>
                 <w:sz w:val="19"/>
               </w:rPr>
-              <w:t>Estándar (pasaje único)</w:t>
+              <w:t>Desbalanceado</w:t>
+            </w:r>
+          </w:p>
+        </w:tc>
+      </w:tr>
+      <w:tr>
+        <w:tc>
+          <w:tcPr>
+            <w:tcW w:type="dxa" w:w="3118"/>
+          </w:tcPr>
+          <w:p>
+            <w:r>
+              <w:rPr>
+                <w:sz w:val="19"/>
+              </w:rPr>
+              <w:t>Característica</w:t>
+            </w:r>
+          </w:p>
+        </w:tc>
+        <w:tc>
+          <w:tcPr>
+            <w:tcW w:type="dxa" w:w="6236"/>
+          </w:tcPr>
+          <w:p>
+            <w:r>
+              <w:rPr>
+                <w:sz w:val="19"/>
+              </w:rPr>
+              <w:t>Lineal</w:t>
             </w:r>
           </w:p>
         </w:tc>
@@ -8269,7 +8296,7 @@
               <w:rPr>
                 <w:sz w:val="19"/>
               </w:rPr>
-              <w:t>0,97</w:t>
+              <w:t>0,93</w:t>
             </w:r>
           </w:p>
         </w:tc>
@@ -8282,7 +8309,7 @@
               <w:rPr>
                 <w:sz w:val="19"/>
               </w:rPr>
-              <w:t>0,97</w:t>
+              <w:t>0,93</w:t>
             </w:r>
           </w:p>
         </w:tc>
@@ -8295,7 +8322,7 @@
               <w:rPr>
                 <w:sz w:val="19"/>
               </w:rPr>
-              <w:t>0,97</w:t>
+              <w:t>0,93</w:t>
             </w:r>
           </w:p>
         </w:tc>
@@ -8349,7 +8376,7 @@
               <w:rPr>
                 <w:sz w:val="19"/>
               </w:rPr>
-              <w:t>0,81</w:t>
+              <w:t>0,7</w:t>
             </w:r>
           </w:p>
         </w:tc>
@@ -8362,7 +8389,7 @@
               <w:rPr>
                 <w:sz w:val="19"/>
               </w:rPr>
-              <w:t>0,81</w:t>
+              <w:t>0,7</w:t>
             </w:r>
           </w:p>
         </w:tc>
@@ -8375,7 +8402,7 @@
               <w:rPr>
                 <w:sz w:val="19"/>
               </w:rPr>
-              <w:t>0,81</w:t>
+              <w:t>0,7</w:t>
             </w:r>
           </w:p>
         </w:tc>
@@ -8429,7 +8456,7 @@
               <w:rPr>
                 <w:sz w:val="19"/>
               </w:rPr>
-              <w:t>0,07</w:t>
+              <w:t>0,1</w:t>
             </w:r>
           </w:p>
         </w:tc>
@@ -8442,7 +8469,7 @@
               <w:rPr>
                 <w:sz w:val="19"/>
               </w:rPr>
-              <w:t>0,07</w:t>
+              <w:t>0,1</w:t>
             </w:r>
           </w:p>
         </w:tc>
@@ -8455,7 +8482,7 @@
               <w:rPr>
                 <w:sz w:val="19"/>
               </w:rPr>
-              <w:t>0,07</w:t>
+              <w:t>0,1</w:t>
             </w:r>
           </w:p>
         </w:tc>
@@ -8509,7 +8536,7 @@
               <w:rPr>
                 <w:sz w:val="19"/>
               </w:rPr>
-              <w:t>0,95</w:t>
+              <w:t>0,85</w:t>
             </w:r>
           </w:p>
         </w:tc>
@@ -8522,7 +8549,7 @@
               <w:rPr>
                 <w:sz w:val="19"/>
               </w:rPr>
-              <w:t>0,95</w:t>
+              <w:t>0,85</w:t>
             </w:r>
           </w:p>
         </w:tc>
@@ -8535,7 +8562,7 @@
               <w:rPr>
                 <w:sz w:val="19"/>
               </w:rPr>
-              <w:t>0,95</w:t>
+              <w:t>0,85</w:t>
             </w:r>
           </w:p>
         </w:tc>
@@ -8892,7 +8919,7 @@
     </w:p>
     <w:p>
       <w:r>
-        <w:t>Válvula: Globo, 2" (DN 50), CL600, RF bridada; internos: globo, internos multietapa (anticavitación severa), flujo tiende a abrir; Cv nominal típico 26,00. Tamaño del trim (diámetro del puerto): 2 1/4 in (57,1 mm) estimado · Carrera nominal: 1 1/2 in (38,1 mm) estimada Cv máximo requerido: 19,59 · Hay condiciones críticas: vea las alertas y el informe técnico.</w:t>
+        <w:t>Válvula: Globo, 2" (DN 50), CL600, RF bridada; internos: globo, jaula anticavitación de 1 etapa, flujo tiende a abrir; Cv nominal típico 42,00. Tamaño del trim (diámetro del puerto): 2 in (50,8 mm) estimado · Carrera nominal: 1 1/8 in (28,6 mm) estimada Cv máximo requerido: 20,43 · Hay condiciones críticas: vea las alertas y el informe técnico.</w:t>
       </w:r>
     </w:p>
     <w:tbl>
@@ -9027,7 +9054,7 @@
               <w:rPr>
                 <w:sz w:val="19"/>
               </w:rPr>
-              <w:t>5,780</w:t>
+              <w:t>6,028</w:t>
             </w:r>
           </w:p>
         </w:tc>
@@ -9040,7 +9067,7 @@
               <w:rPr>
                 <w:sz w:val="19"/>
               </w:rPr>
-              <w:t>13,26</w:t>
+              <w:t>13,83</w:t>
             </w:r>
           </w:p>
         </w:tc>
@@ -9053,7 +9080,7 @@
               <w:rPr>
                 <w:sz w:val="19"/>
               </w:rPr>
-              <w:t>19,59</w:t>
+              <w:t>20,43</w:t>
             </w:r>
           </w:p>
         </w:tc>
@@ -9094,7 +9121,7 @@
               <w:rPr>
                 <w:sz w:val="19"/>
               </w:rPr>
-              <w:t>19,8</w:t>
+              <w:t>8,24</w:t>
             </w:r>
           </w:p>
         </w:tc>
@@ -9107,7 +9134,7 @@
               <w:rPr>
                 <w:sz w:val="19"/>
               </w:rPr>
-              <w:t>49,5</w:t>
+              <w:t>28,1</w:t>
             </w:r>
           </w:p>
         </w:tc>
@@ -9120,7 +9147,7 @@
               <w:rPr>
                 <w:sz w:val="19"/>
               </w:rPr>
-              <w:t>74,6</w:t>
+              <w:t>45,0</w:t>
             </w:r>
           </w:p>
         </w:tc>
@@ -9295,7 +9322,7 @@
               <w:rPr>
                 <w:sz w:val="19"/>
               </w:rPr>
-              <w:t>0,941</w:t>
+              <w:t>0,504</w:t>
             </w:r>
           </w:p>
         </w:tc>
@@ -9308,7 +9335,7 @@
               <w:rPr>
                 <w:sz w:val="19"/>
               </w:rPr>
-              <w:t>0,939</w:t>
+              <w:t>0,459</w:t>
             </w:r>
           </w:p>
         </w:tc>
@@ -9321,7 +9348,7 @@
               <w:rPr>
                 <w:sz w:val="19"/>
               </w:rPr>
-              <w:t>0,938</w:t>
+              <w:t>0,437</w:t>
             </w:r>
           </w:p>
         </w:tc>
@@ -9362,7 +9389,7 @@
               <w:rPr>
                 <w:sz w:val="19"/>
               </w:rPr>
-              <w:t>68,21</w:t>
+              <w:t>62,71</w:t>
             </w:r>
           </w:p>
         </w:tc>
@@ -9375,7 +9402,7 @@
               <w:rPr>
                 <w:sz w:val="19"/>
               </w:rPr>
-              <w:t>66,24</w:t>
+              <w:t>60,96</w:t>
             </w:r>
           </w:p>
         </w:tc>
@@ -9388,7 +9415,7 @@
               <w:rPr>
                 <w:sz w:val="19"/>
               </w:rPr>
-              <w:t>64,25</w:t>
+              <w:t>59,20</w:t>
             </w:r>
           </w:p>
         </w:tc>
@@ -9442,7 +9469,7 @@
               <w:rPr>
                 <w:sz w:val="19"/>
               </w:rPr>
-              <w:t>0,994</w:t>
+              <w:t>0,993</w:t>
             </w:r>
           </w:p>
         </w:tc>
@@ -9455,7 +9482,7 @@
               <w:rPr>
                 <w:sz w:val="19"/>
               </w:rPr>
-              <w:t>0,987</w:t>
+              <w:t>0,986</w:t>
             </w:r>
           </w:p>
         </w:tc>
@@ -9496,7 +9523,7 @@
               <w:rPr>
                 <w:sz w:val="19"/>
               </w:rPr>
-              <w:t>0,969</w:t>
+              <w:t>0,929</w:t>
             </w:r>
           </w:p>
         </w:tc>
@@ -9509,7 +9536,7 @@
               <w:rPr>
                 <w:sz w:val="19"/>
               </w:rPr>
-              <w:t>0,963</w:t>
+              <w:t>0,924</w:t>
             </w:r>
           </w:p>
         </w:tc>
@@ -9522,7 +9549,7 @@
               <w:rPr>
                 <w:sz w:val="19"/>
               </w:rPr>
-              <w:t>0,956</w:t>
+              <w:t>0,916</w:t>
             </w:r>
           </w:p>
         </w:tc>
@@ -9697,7 +9724,7 @@
               <w:rPr>
                 <w:sz w:val="19"/>
               </w:rPr>
-              <w:t>214.811</w:t>
+              <w:t>306.873</w:t>
             </w:r>
           </w:p>
         </w:tc>
@@ -9710,7 +9737,7 @@
               <w:rPr>
                 <w:sz w:val="19"/>
               </w:rPr>
-              <w:t>319.169</w:t>
+              <w:t>455.956</w:t>
             </w:r>
           </w:p>
         </w:tc>
@@ -9723,7 +9750,7 @@
               <w:rPr>
                 <w:sz w:val="19"/>
               </w:rPr>
-              <w:t>379.457</w:t>
+              <w:t>542.082</w:t>
             </w:r>
           </w:p>
         </w:tc>
@@ -9764,7 +9791,7 @@
               <w:rPr>
                 <w:sz w:val="19"/>
               </w:rPr>
-              <w:t>77,8</w:t>
+              <w:t>86,3</w:t>
             </w:r>
           </w:p>
         </w:tc>
@@ -9777,7 +9804,7 @@
               <w:rPr>
                 <w:sz w:val="19"/>
               </w:rPr>
-              <w:t>83,9</w:t>
+              <w:t>92,6</w:t>
             </w:r>
           </w:p>
         </w:tc>
@@ -9790,7 +9817,7 @@
               <w:rPr>
                 <w:sz w:val="19"/>
               </w:rPr>
-              <w:t>86,8</w:t>
+              <w:t>95,4</w:t>
             </w:r>
           </w:p>
         </w:tc>
@@ -10499,6 +10526,14 @@
       </w:pPr>
       <w:r>
         <w:t>Crítica: Cavitación con flujo bloqueado</w:t>
+      </w:r>
+    </w:p>
+    <w:p>
+      <w:pPr>
+        <w:pStyle w:val="ListBullet"/>
+      </w:pPr>
+      <w:r>
+        <w:t>Crítica: Ruido por encima del límite</w:t>
       </w:r>
     </w:p>
     <w:p>
@@ -10530,7 +10565,7 @@
         <w:pStyle w:val="ListBullet"/>
       </w:pPr>
       <w:r>
-        <w:t>Advertencia: Velocidad de líquido alta en la válvula</w:t>
+        <w:t>Advertencia: Ruido por encima del límite</w:t>
       </w:r>
     </w:p>
     <w:p>
@@ -10538,7 +10573,15 @@
         <w:pStyle w:val="ListBullet"/>
       </w:pPr>
       <w:r>
-        <w:t>Advertencia: Ruido por encima del límite</w:t>
+        <w:t>Advertencia: Válvula sobredimensionada</w:t>
+      </w:r>
+    </w:p>
+    <w:p>
+      <w:pPr>
+        <w:pStyle w:val="ListBullet"/>
+      </w:pPr>
+      <w:r>
+        <w:t>Advertencia: Velocidad de líquido alta en la válvula</w:t>
       </w:r>
     </w:p>
     <w:p>
@@ -10563,14 +10606,6 @@
       </w:pPr>
       <w:r>
         <w:t>Información: Capacidad nominal típica</w:t>
-      </w:r>
-    </w:p>
-    <w:p>
-      <w:pPr>
-        <w:pStyle w:val="ListBullet"/>
-      </w:pPr>
-      <w:r>
-        <w:t>Información: Ruido cercano al límite</w:t>
       </w:r>
     </w:p>
     <w:p>
@@ -10626,7 +10661,7 @@
         <w:ind w:left="340" w:hanging="340"/>
       </w:pPr>
       <w:r>
-        <w:t>1. Con P2 = 3,5 bar g la válvula queda en flujo bloqueado. ¿Qué contrapresión hace falta para salir de esa condición? Pruebe subir P2 o repartir la caída con un orificio aguas abajo.</w:t>
+        <w:t>1. Con P2 = 3,5 bar g y la jaula de 1 etapa la válvula queda en flujo bloqueado. En «Nivel o etapas» pruebe 2, 3 y 4 etapas: ¿con cuántas sale del bloqueo y de la cavitación, y cómo cambian el tamaño y la apertura? Compare con subir P2 o repartir la caída con un orificio aguas abajo.</w:t>
       </w:r>
     </w:p>
     <w:p>

</xml_diff>

<commit_message>
v0.13.1: tipo de trim sin jaula / con jaula y config dinámica de la jaula
- Tipo de trim: «Sin jaula» (guía y tipo de obturador) o «Con jaula» (obturador cilíndrico).
- Jaula: estándar (caracterizada), anticavitación (líquidos) o antiruido (gases); la config dinámica
  lista cada construcción y nivel de la más simple a la más compleja y se bloquea con jaula estándar.
- Se quitan el obturador de disco plano y la jaula de retención de asiento (pasan a contorneado).
- Migración de proyectos v0.13.0; kit del workshop regenerado.

Co-Authored-By: Claude Opus 5.5 <noreply@anthropic.com>
Claude-Session: https://claude.ai/code/session_01U4yJ7uLSXttFganqs6AWmH
</commit_message>
<xml_diff>
--- a/kit_workshop/Casos_del_workshop_N25-Valves-Sizing.docx
+++ b/kit_workshop/Casos_del_workshop_N25-Valves-Sizing.docx
@@ -710,7 +710,7 @@
               <w:rPr>
                 <w:sz w:val="19"/>
               </w:rPr>
-              <w:t>Jaula</w:t>
+              <w:t>Tipo de obturador</w:t>
             </w:r>
           </w:p>
         </w:tc>
@@ -4063,7 +4063,7 @@
               <w:rPr>
                 <w:sz w:val="19"/>
               </w:rPr>
-              <w:t>Guiado por jaula</w:t>
+              <w:t>Con jaula</w:t>
             </w:r>
           </w:p>
         </w:tc>
@@ -4078,6 +4078,34 @@
               <w:rPr>
                 <w:sz w:val="19"/>
               </w:rPr>
+              <w:t>Tipo de obturador</w:t>
+            </w:r>
+          </w:p>
+        </w:tc>
+        <w:tc>
+          <w:tcPr>
+            <w:tcW w:type="dxa" w:w="6236"/>
+          </w:tcPr>
+          <w:p>
+            <w:r>
+              <w:rPr>
+                <w:sz w:val="19"/>
+              </w:rPr>
+              <w:t>Cilíndrico</w:t>
+            </w:r>
+          </w:p>
+        </w:tc>
+      </w:tr>
+      <w:tr>
+        <w:tc>
+          <w:tcPr>
+            <w:tcW w:type="dxa" w:w="3118"/>
+          </w:tcPr>
+          <w:p>
+            <w:r>
+              <w:rPr>
+                <w:sz w:val="19"/>
+              </w:rPr>
               <w:t>Jaula</w:t>
             </w:r>
           </w:p>
@@ -4091,7 +4119,7 @@
               <w:rPr>
                 <w:sz w:val="19"/>
               </w:rPr>
-              <w:t>Jaula caracterizada de ventanas</w:t>
+              <w:t>Jaula estándar (caracterizada)</w:t>
             </w:r>
           </w:p>
         </w:tc>
@@ -7062,7 +7090,7 @@
         <w:ind w:left="340" w:hanging="340"/>
       </w:pPr>
       <w:r>
-        <w:t>1. El ruido con trim estándar supera el límite de 85 dB(A). En 2-Cálculos Válvula elija la jaula «Jaula multiorificio de bajo ruido» y pruebe los niveles 2 y 3; luego la «Jaula multietapa multiorificio» con 2 y 3 etapas: ¿cuánto baja cada una y cuál alcanza?</w:t>
+        <w:t>1. El ruido con trim estándar supera el límite de 85 dB(A). En 2-Cálculos Válvula elija «Jaula antiruido» y en «Config dinámica de la jaula» pruebe multiorificio nivel 2 y nivel 3, y luego multietapa multiorificio de 2 y 3 etapas: ¿cuánto baja cada una y cuál alcanza?</w:t>
       </w:r>
     </w:p>
     <w:p>
@@ -7468,7 +7496,7 @@
               <w:rPr>
                 <w:sz w:val="19"/>
               </w:rPr>
-              <w:t>Guiado por jaula</w:t>
+              <w:t>Con jaula</w:t>
             </w:r>
           </w:p>
         </w:tc>
@@ -7483,7 +7511,7 @@
               <w:rPr>
                 <w:sz w:val="19"/>
               </w:rPr>
-              <w:t>Jaula</w:t>
+              <w:t>Tipo de obturador</w:t>
             </w:r>
           </w:p>
         </w:tc>
@@ -7496,7 +7524,7 @@
               <w:rPr>
                 <w:sz w:val="19"/>
               </w:rPr>
-              <w:t>Jaula anticavitación</w:t>
+              <w:t>Cilíndrico</w:t>
             </w:r>
           </w:p>
         </w:tc>
@@ -7511,7 +7539,7 @@
               <w:rPr>
                 <w:sz w:val="19"/>
               </w:rPr>
-              <w:t>Nivel o etapas</w:t>
+              <w:t>Jaula</w:t>
             </w:r>
           </w:p>
         </w:tc>
@@ -7524,7 +7552,35 @@
               <w:rPr>
                 <w:sz w:val="19"/>
               </w:rPr>
-              <w:t>1 etapa – Kc 0,85, FL 0,93</w:t>
+              <w:t>Jaula anticavitación</w:t>
+            </w:r>
+          </w:p>
+        </w:tc>
+      </w:tr>
+      <w:tr>
+        <w:tc>
+          <w:tcPr>
+            <w:tcW w:type="dxa" w:w="3118"/>
+          </w:tcPr>
+          <w:p>
+            <w:r>
+              <w:rPr>
+                <w:sz w:val="19"/>
+              </w:rPr>
+              <w:t>Config dinámica de la jaula</w:t>
+            </w:r>
+          </w:p>
+        </w:tc>
+        <w:tc>
+          <w:tcPr>
+            <w:tcW w:type="dxa" w:w="6236"/>
+          </w:tcPr>
+          <w:p>
+            <w:r>
+              <w:rPr>
+                <w:sz w:val="19"/>
+              </w:rPr>
+              <w:t>Jaula perforada, 1 etapa – Kc 0,85, FL 0,93</w:t>
             </w:r>
           </w:p>
         </w:tc>
@@ -10661,7 +10717,7 @@
         <w:ind w:left="340" w:hanging="340"/>
       </w:pPr>
       <w:r>
-        <w:t>1. Con P2 = 3,5 bar g y la jaula de 1 etapa la válvula queda en flujo bloqueado. En «Nivel o etapas» pruebe 2, 3 y 4 etapas: ¿con cuántas sale del bloqueo y de la cavitación, y cómo cambian el tamaño y la apertura? Compare con subir P2 o repartir la caída con un orificio aguas abajo.</w:t>
+        <w:t>1. Con P2 = 3,5 bar g y la jaula de 1 etapa la válvula queda en flujo bloqueado. En «Config dinámica de la jaula» pruebe la jaula perforada de 2, 3 y 4 etapas: ¿con cuántas sale del bloqueo y de la cavitación, y cómo cambian el tamaño y la apertura? Compare con subir P2 o repartir la caída con un orificio aguas abajo.</w:t>
       </w:r>
     </w:p>
     <w:p>

</xml_diff>

<commit_message>
v0.13.4: área de salida de la válvula automática (tabla ASME B36 completa)
- tuberias: tabla ASME B36.10M / B36.19M de 1/8" a 80" (44 tamaños, 379
  combinaciones NPS-cédula), área interior π/4·DI² y área de salida de la
  válvula con el NPS de la válvula y la cédula de salida; si la cédula no
  existe para ese tamaño se usa STD con aviso.
- Fila «Área de salida de la válvula» con desplegable Automático / Manual,
  visible también en líquidos; el área gobierna la velocidad de salida
  (líquido, bifásico y gas) y el ruido aerodinámico IEC 60534-8-3.
- Memoria y hoja de datos muestran el área y su origen.
- Proyectos anteriores con área cargada quedan en Manual.
- Se quita el botón «Nuevo cálculo» de la v0.13.3 por decisión de Andrea
  (revert de 0817fce); la base de esta versión es la 0.13.2.
- Kit del workshop regenerado.

Co-Authored-By: Claude Opus 5.5 <noreply@anthropic.com>
Claude-Session: https://claude.ai/code/session_01U4yJ7uLSXttFganqs6AWmH
</commit_message>
<xml_diff>
--- a/kit_workshop/Casos_del_workshop_N25-Valves-Sizing.docx
+++ b/kit_workshop/Casos_del_workshop_N25-Valves-Sizing.docx
@@ -6067,7 +6067,7 @@
               <w:rPr>
                 <w:sz w:val="19"/>
               </w:rPr>
-              <w:t>97,5</w:t>
+              <w:t>97,7</w:t>
             </w:r>
           </w:p>
         </w:tc>
@@ -6134,7 +6134,7 @@
               <w:rPr>
                 <w:sz w:val="19"/>
               </w:rPr>
-              <w:t>97,5</w:t>
+              <w:t>97,7</w:t>
             </w:r>
           </w:p>
         </w:tc>
@@ -6268,7 +6268,7 @@
               <w:rPr>
                 <w:sz w:val="19"/>
               </w:rPr>
-              <w:t>0,111</w:t>
+              <w:t>0,106</w:t>
             </w:r>
           </w:p>
         </w:tc>
@@ -6281,7 +6281,7 @@
               <w:rPr>
                 <w:sz w:val="19"/>
               </w:rPr>
-              <w:t>0,166</w:t>
+              <w:t>0,159</w:t>
             </w:r>
           </w:p>
         </w:tc>
@@ -6294,7 +6294,7 @@
               <w:rPr>
                 <w:sz w:val="19"/>
               </w:rPr>
-              <w:t>0,250</w:t>
+              <w:t>0,239</w:t>
             </w:r>
           </w:p>
         </w:tc>
@@ -6335,7 +6335,7 @@
               <w:rPr>
                 <w:sz w:val="19"/>
               </w:rPr>
-              <w:t>68,2</w:t>
+              <w:t>65,2</w:t>
             </w:r>
           </w:p>
         </w:tc>
@@ -6348,7 +6348,7 @@
               <w:rPr>
                 <w:sz w:val="19"/>
               </w:rPr>
-              <w:t>102</w:t>
+              <w:t>97,9</w:t>
             </w:r>
           </w:p>
         </w:tc>
@@ -6361,7 +6361,7 @@
               <w:rPr>
                 <w:sz w:val="19"/>
               </w:rPr>
-              <w:t>154</w:t>
+              <w:t>147</w:t>
             </w:r>
           </w:p>
         </w:tc>

</xml_diff>